<commit_message>
Hogar de Refugio: observaciones de mobiliario actualizadas (SUM según el plano)
Co-Authored-By: Claude Opus 5.5 <noreply@anthropic.com>
Claude-Session: https://claude.ai/code/session_0142t8T16igb3VKxUPwnQPq6
</commit_message>
<xml_diff>
--- a/entregables/revision_interna/OBSERVACIONES_SUBSANADAS_Y_PENDIENTES_MOBILIARIO_HOGAR_REFUGIO.docx
+++ b/entregables/revision_interna/OBSERVACIONES_SUBSANADAS_Y_PENDIENTES_MOBILIARIO_HOGAR_REFUGIO.docx
@@ -3660,6 +3660,51 @@
           </w:p>
         </w:tc>
       </w:tr>
+      <w:tr>
+        <w:trPr>
+          <w:cantSplit/>
+        </w:trPr>
+        <w:tc>
+          <w:tcPr>
+            <w:tcW w:type="dxa" w:w="2041"/>
+            <w:vAlign w:val="center"/>
+          </w:tcPr>
+          <w:p>
+            <w:pPr>
+              <w:spacing w:after="20" w:before="20"/>
+              <w:jc w:val="left"/>
+            </w:pPr>
+            <w:r>
+              <w:rPr>
+                <w:b w:val="0"/>
+                <w:i w:val="0"/>
+                <w:sz w:val="17"/>
+              </w:rPr>
+              <w:t>Capacidad del SUM-comedor</w:t>
+            </w:r>
+          </w:p>
+        </w:tc>
+        <w:tc>
+          <w:tcPr>
+            <w:tcW w:type="dxa" w:w="7597"/>
+            <w:vAlign w:val="center"/>
+          </w:tcPr>
+          <w:p>
+            <w:pPr>
+              <w:spacing w:after="20" w:before="20"/>
+              <w:jc w:val="left"/>
+            </w:pPr>
+            <w:r>
+              <w:rPr>
+                <w:b w:val="0"/>
+                <w:i w:val="0"/>
+                <w:sz w:val="17"/>
+              </w:rPr>
+              <w:t>Manda el plano: 24 mesas M16 y 192 sillas M3 (8 por mesa), contadas en la planta de EM-04. No se usan las 384 sillas del cuadro ni las 80 personas de la memoria de arquitectura.</w:t>
+            </w:r>
+          </w:p>
+        </w:tc>
+      </w:tr>
     </w:tbl>
     <w:p>
       <w:pPr>
@@ -7211,6 +7256,91 @@
           </w:p>
         </w:tc>
       </w:tr>
+      <w:tr>
+        <w:trPr>
+          <w:cantSplit/>
+        </w:trPr>
+        <w:tc>
+          <w:tcPr>
+            <w:tcW w:type="dxa" w:w="510"/>
+            <w:vAlign w:val="center"/>
+          </w:tcPr>
+          <w:p>
+            <w:pPr>
+              <w:spacing w:after="20" w:before="20"/>
+              <w:jc w:val="center"/>
+            </w:pPr>
+            <w:r>
+              <w:rPr>
+                <w:b w:val="0"/>
+                <w:i w:val="0"/>
+                <w:sz w:val="16"/>
+              </w:rPr>
+              <w:t>41</w:t>
+            </w:r>
+          </w:p>
+        </w:tc>
+        <w:tc>
+          <w:tcPr>
+            <w:tcW w:type="dxa" w:w="1077"/>
+            <w:vAlign w:val="center"/>
+          </w:tcPr>
+          <w:p>
+            <w:pPr>
+              <w:spacing w:after="20" w:before="20"/>
+              <w:jc w:val="center"/>
+            </w:pPr>
+            <w:r>
+              <w:rPr>
+                <w:b w:val="0"/>
+                <w:i w:val="0"/>
+                <w:sz w:val="16"/>
+              </w:rPr>
+              <w:t>Memoria de arquitectura</w:t>
+            </w:r>
+          </w:p>
+        </w:tc>
+        <w:tc>
+          <w:tcPr>
+            <w:tcW w:type="dxa" w:w="737"/>
+            <w:vAlign w:val="center"/>
+          </w:tcPr>
+          <w:p>
+            <w:pPr>
+              <w:spacing w:after="20" w:before="20"/>
+              <w:jc w:val="center"/>
+            </w:pPr>
+            <w:r>
+              <w:rPr>
+                <w:b w:val="0"/>
+                <w:i w:val="0"/>
+                <w:sz w:val="16"/>
+              </w:rPr>
+              <w:t>E-05</w:t>
+            </w:r>
+          </w:p>
+        </w:tc>
+        <w:tc>
+          <w:tcPr>
+            <w:tcW w:type="dxa" w:w="7314"/>
+            <w:vAlign w:val="center"/>
+          </w:tcPr>
+          <w:p>
+            <w:pPr>
+              <w:spacing w:after="20" w:before="20"/>
+              <w:jc w:val="left"/>
+            </w:pPr>
+            <w:r>
+              <w:rPr>
+                <w:b w:val="0"/>
+                <w:i w:val="0"/>
+                <w:sz w:val="16"/>
+              </w:rPr>
+              <w:t>La memoria descriptiva de arquitectura considera el SUM-comedor para 80 personas; la planta de EM-04 tiene 24 mesas y 192 sillas. Ajustar la capacidad de la memoria a la planta (192).</w:t>
+            </w:r>
+          </w:p>
+        </w:tc>
+      </w:tr>
     </w:tbl>
     <w:p>
       <w:pPr>
@@ -7337,72 +7467,6 @@
                 <w:sz w:val="17"/>
               </w:rPr>
               <w:t>SI LA ARQUITECTA LO CAMBIA</w:t>
-            </w:r>
-          </w:p>
-        </w:tc>
-      </w:tr>
-      <w:tr>
-        <w:trPr>
-          <w:cantSplit/>
-        </w:trPr>
-        <w:tc>
-          <w:tcPr>
-            <w:tcW w:type="dxa" w:w="1814"/>
-            <w:shd w:val="clear" w:color="auto" w:fill="FFF2CC"/>
-            <w:vAlign w:val="center"/>
-          </w:tcPr>
-          <w:p>
-            <w:pPr>
-              <w:spacing w:after="20" w:before="20"/>
-              <w:jc w:val="left"/>
-            </w:pPr>
-            <w:r>
-              <w:rPr>
-                <w:b w:val="0"/>
-                <w:i w:val="0"/>
-                <w:sz w:val="17"/>
-              </w:rPr>
-              <w:t>Capacidad del SUM-comedor</w:t>
-            </w:r>
-          </w:p>
-        </w:tc>
-        <w:tc>
-          <w:tcPr>
-            <w:tcW w:type="dxa" w:w="3628"/>
-            <w:vAlign w:val="center"/>
-          </w:tcPr>
-          <w:p>
-            <w:pPr>
-              <w:spacing w:after="20" w:before="20"/>
-              <w:jc w:val="left"/>
-            </w:pPr>
-            <w:r>
-              <w:rPr>
-                <w:b w:val="0"/>
-                <w:i w:val="0"/>
-                <w:sz w:val="17"/>
-              </w:rPr>
-              <w:t>Se metran 24 mesas M16 y 192 sillas M3, como en la planta; la memoria de arquitectura dice 80 personas.</w:t>
-            </w:r>
-          </w:p>
-        </w:tc>
-        <w:tc>
-          <w:tcPr>
-            <w:tcW w:type="dxa" w:w="4195"/>
-            <w:vAlign w:val="center"/>
-          </w:tcPr>
-          <w:p>
-            <w:pPr>
-              <w:spacing w:after="20" w:before="20"/>
-              <w:jc w:val="left"/>
-            </w:pPr>
-            <w:r>
-              <w:rPr>
-                <w:b w:val="0"/>
-                <w:i w:val="0"/>
-                <w:sz w:val="17"/>
-              </w:rPr>
-              <w:t>Si se reduce (por ejemplo a 10 mesas y 80 sillas), cambian las partidas de M16 y M3.</w:t>
             </w:r>
           </w:p>
         </w:tc>

</xml_diff>